<commit_message>
Round-2 Review: Duration Fix, Fragility of the Verdict, Safer Clinical Wording
Co-Authored-By: Claude Opus 5.5 (1M context) <noreply@anthropic.com>
</commit_message>
<xml_diff>
--- a/paper/supplement.docx
+++ b/paper/supplement.docx
@@ -15454,7 +15454,587 @@
         <w:pStyle w:val="FirstParagraph"/>
       </w:pPr>
       <w:r>
-        <w:t xml:space="preserve">F1 × R3: expected AKI among the 33 discordant patients 1.57; probability of none 0.19. ROR if k of the 28 upward-moved patients had AKI: k = 0: 0.96, k = 1: 1.01, k = 2: 1.07, k = 3: 1.13, k = 4: 1.20, k = 5: 1.27.</w:t>
+        <w:t xml:space="preserve">F1 × R3: expected AKI among the 33 discordant patients 1.57; probability of none 0.19.</w:t>
+      </w:r>
+    </w:p>
+    <w:tbl>
+      <w:tblPr>
+        <w:tblStyle w:val="Table"/>
+        <w:tblW w:type="auto" w:w="0"/>
+        <w:tblLook w:firstRow="1" w:lastRow="0" w:firstColumn="0" w:lastColumn="0" w:noHBand="0" w:noVBand="0" w:val="0020"/>
+      </w:tblPr>
+      <w:tblGrid>
+        <w:gridCol w:w="1131"/>
+        <w:gridCol w:w="1131"/>
+        <w:gridCol w:w="1131"/>
+        <w:gridCol w:w="1131"/>
+        <w:gridCol w:w="1131"/>
+        <w:gridCol w:w="1131"/>
+        <w:gridCol w:w="1131"/>
+      </w:tblGrid>
+      <w:tr>
+        <w:trPr>
+          <w:tblHeader w:val="on"/>
+        </w:trPr>
+        <w:tc>
+          <w:tcPr/>
+          <w:p>
+            <w:pPr>
+              <w:pStyle w:val="Compact"/>
+            </w:pPr>
+            <w:r>
+              <w:t xml:space="preserve">k</w:t>
+            </w:r>
+          </w:p>
+        </w:tc>
+        <w:tc>
+          <w:tcPr/>
+          <w:p>
+            <w:pPr>
+              <w:pStyle w:val="Compact"/>
+            </w:pPr>
+            <w:r>
+              <w:t xml:space="preserve">ror</w:t>
+            </w:r>
+          </w:p>
+        </w:tc>
+        <w:tc>
+          <w:tcPr/>
+          <w:p>
+            <w:pPr>
+              <w:pStyle w:val="Compact"/>
+            </w:pPr>
+            <w:r>
+              <w:t xml:space="preserve">lo</w:t>
+            </w:r>
+          </w:p>
+        </w:tc>
+        <w:tc>
+          <w:tcPr/>
+          <w:p>
+            <w:pPr>
+              <w:pStyle w:val="Compact"/>
+            </w:pPr>
+            <w:r>
+              <w:t xml:space="preserve">hi</w:t>
+            </w:r>
+          </w:p>
+        </w:tc>
+        <w:tc>
+          <w:tcPr/>
+          <w:p>
+            <w:pPr>
+              <w:pStyle w:val="Compact"/>
+            </w:pPr>
+            <w:r>
+              <w:t xml:space="preserve">n</w:t>
+            </w:r>
+          </w:p>
+        </w:tc>
+        <w:tc>
+          <w:tcPr/>
+          <w:p>
+            <w:pPr>
+              <w:pStyle w:val="Compact"/>
+            </w:pPr>
+            <w:r>
+              <w:t xml:space="preserve">events</w:t>
+            </w:r>
+          </w:p>
+        </w:tc>
+        <w:tc>
+          <w:tcPr/>
+          <w:p>
+            <w:pPr>
+              <w:pStyle w:val="Compact"/>
+            </w:pPr>
+            <w:r>
+              <w:t xml:space="preserve">verdict</w:t>
+            </w:r>
+          </w:p>
+        </w:tc>
+      </w:tr>
+      <w:tr>
+        <w:tc>
+          <w:tcPr/>
+          <w:p>
+            <w:pPr>
+              <w:pStyle w:val="Compact"/>
+            </w:pPr>
+            <w:r>
+              <w:t xml:space="preserve">0</w:t>
+            </w:r>
+          </w:p>
+        </w:tc>
+        <w:tc>
+          <w:tcPr/>
+          <w:p>
+            <w:pPr>
+              <w:pStyle w:val="Compact"/>
+            </w:pPr>
+            <w:r>
+              <w:t xml:space="preserve">0.956</w:t>
+            </w:r>
+          </w:p>
+        </w:tc>
+        <w:tc>
+          <w:tcPr/>
+          <w:p>
+            <w:pPr>
+              <w:pStyle w:val="Compact"/>
+            </w:pPr>
+            <w:r>
+              <w:t xml:space="preserve">0.856</w:t>
+            </w:r>
+          </w:p>
+        </w:tc>
+        <w:tc>
+          <w:tcPr/>
+          <w:p>
+            <w:pPr>
+              <w:pStyle w:val="Compact"/>
+            </w:pPr>
+            <w:r>
+              <w:t xml:space="preserve">1.068</w:t>
+            </w:r>
+          </w:p>
+        </w:tc>
+        <w:tc>
+          <w:tcPr/>
+          <w:p>
+            <w:pPr>
+              <w:pStyle w:val="Compact"/>
+            </w:pPr>
+            <w:r>
+              <w:t xml:space="preserve">2563</w:t>
+            </w:r>
+          </w:p>
+        </w:tc>
+        <w:tc>
+          <w:tcPr/>
+          <w:p>
+            <w:pPr>
+              <w:pStyle w:val="Compact"/>
+            </w:pPr>
+            <w:r>
+              <w:t xml:space="preserve">91</w:t>
+            </w:r>
+          </w:p>
+        </w:tc>
+        <w:tc>
+          <w:tcPr/>
+          <w:p>
+            <w:pPr>
+              <w:pStyle w:val="Compact"/>
+            </w:pPr>
+            <w:r>
+              <w:t xml:space="preserve">equivalent</w:t>
+            </w:r>
+          </w:p>
+        </w:tc>
+      </w:tr>
+      <w:tr>
+        <w:tc>
+          <w:tcPr/>
+          <w:p>
+            <w:pPr>
+              <w:pStyle w:val="Compact"/>
+            </w:pPr>
+            <w:r>
+              <w:t xml:space="preserve">1</w:t>
+            </w:r>
+          </w:p>
+        </w:tc>
+        <w:tc>
+          <w:tcPr/>
+          <w:p>
+            <w:pPr>
+              <w:pStyle w:val="Compact"/>
+            </w:pPr>
+            <w:r>
+              <w:t xml:space="preserve">1.013</w:t>
+            </w:r>
+          </w:p>
+        </w:tc>
+        <w:tc>
+          <w:tcPr/>
+          <w:p>
+            <w:pPr>
+              <w:pStyle w:val="Compact"/>
+            </w:pPr>
+            <w:r>
+              <w:t xml:space="preserve">0.901</w:t>
+            </w:r>
+          </w:p>
+        </w:tc>
+        <w:tc>
+          <w:tcPr/>
+          <w:p>
+            <w:pPr>
+              <w:pStyle w:val="Compact"/>
+            </w:pPr>
+            <w:r>
+              <w:t xml:space="preserve">1.138</w:t>
+            </w:r>
+          </w:p>
+        </w:tc>
+        <w:tc>
+          <w:tcPr/>
+          <w:p>
+            <w:pPr>
+              <w:pStyle w:val="Compact"/>
+            </w:pPr>
+            <w:r>
+              <w:t xml:space="preserve">2563</w:t>
+            </w:r>
+          </w:p>
+        </w:tc>
+        <w:tc>
+          <w:tcPr/>
+          <w:p>
+            <w:pPr>
+              <w:pStyle w:val="Compact"/>
+            </w:pPr>
+            <w:r>
+              <w:t xml:space="preserve">91</w:t>
+            </w:r>
+          </w:p>
+        </w:tc>
+        <w:tc>
+          <w:tcPr/>
+          <w:p>
+            <w:pPr>
+              <w:pStyle w:val="Compact"/>
+            </w:pPr>
+            <w:r>
+              <w:t xml:space="preserve">equivalent</w:t>
+            </w:r>
+          </w:p>
+        </w:tc>
+      </w:tr>
+      <w:tr>
+        <w:tc>
+          <w:tcPr/>
+          <w:p>
+            <w:pPr>
+              <w:pStyle w:val="Compact"/>
+            </w:pPr>
+            <w:r>
+              <w:t xml:space="preserve">2</w:t>
+            </w:r>
+          </w:p>
+        </w:tc>
+        <w:tc>
+          <w:tcPr/>
+          <w:p>
+            <w:pPr>
+              <w:pStyle w:val="Compact"/>
+            </w:pPr>
+            <w:r>
+              <w:t xml:space="preserve">1.070</w:t>
+            </w:r>
+          </w:p>
+        </w:tc>
+        <w:tc>
+          <w:tcPr/>
+          <w:p>
+            <w:pPr>
+              <w:pStyle w:val="Compact"/>
+            </w:pPr>
+            <w:r>
+              <w:t xml:space="preserve">0.900</w:t>
+            </w:r>
+          </w:p>
+        </w:tc>
+        <w:tc>
+          <w:tcPr/>
+          <w:p>
+            <w:pPr>
+              <w:pStyle w:val="Compact"/>
+            </w:pPr>
+            <w:r>
+              <w:t xml:space="preserve">1.272</w:t>
+            </w:r>
+          </w:p>
+        </w:tc>
+        <w:tc>
+          <w:tcPr/>
+          <w:p>
+            <w:pPr>
+              <w:pStyle w:val="Compact"/>
+            </w:pPr>
+            <w:r>
+              <w:t xml:space="preserve">2563</w:t>
+            </w:r>
+          </w:p>
+        </w:tc>
+        <w:tc>
+          <w:tcPr/>
+          <w:p>
+            <w:pPr>
+              <w:pStyle w:val="Compact"/>
+            </w:pPr>
+            <w:r>
+              <w:t xml:space="preserve">91</w:t>
+            </w:r>
+          </w:p>
+        </w:tc>
+        <w:tc>
+          <w:tcPr/>
+          <w:p>
+            <w:pPr>
+              <w:pStyle w:val="Compact"/>
+            </w:pPr>
+            <w:r>
+              <w:t xml:space="preserve">inconclusive</w:t>
+            </w:r>
+          </w:p>
+        </w:tc>
+      </w:tr>
+      <w:tr>
+        <w:tc>
+          <w:tcPr/>
+          <w:p>
+            <w:pPr>
+              <w:pStyle w:val="Compact"/>
+            </w:pPr>
+            <w:r>
+              <w:t xml:space="preserve">3</w:t>
+            </w:r>
+          </w:p>
+        </w:tc>
+        <w:tc>
+          <w:tcPr/>
+          <w:p>
+            <w:pPr>
+              <w:pStyle w:val="Compact"/>
+            </w:pPr>
+            <w:r>
+              <w:t xml:space="preserve">1.129</w:t>
+            </w:r>
+          </w:p>
+        </w:tc>
+        <w:tc>
+          <w:tcPr/>
+          <w:p>
+            <w:pPr>
+              <w:pStyle w:val="Compact"/>
+            </w:pPr>
+            <w:r>
+              <w:t xml:space="preserve">0.938</w:t>
+            </w:r>
+          </w:p>
+        </w:tc>
+        <w:tc>
+          <w:tcPr/>
+          <w:p>
+            <w:pPr>
+              <w:pStyle w:val="Compact"/>
+            </w:pPr>
+            <w:r>
+              <w:t xml:space="preserve">1.358</w:t>
+            </w:r>
+          </w:p>
+        </w:tc>
+        <w:tc>
+          <w:tcPr/>
+          <w:p>
+            <w:pPr>
+              <w:pStyle w:val="Compact"/>
+            </w:pPr>
+            <w:r>
+              <w:t xml:space="preserve">2563</w:t>
+            </w:r>
+          </w:p>
+        </w:tc>
+        <w:tc>
+          <w:tcPr/>
+          <w:p>
+            <w:pPr>
+              <w:pStyle w:val="Compact"/>
+            </w:pPr>
+            <w:r>
+              <w:t xml:space="preserve">91</w:t>
+            </w:r>
+          </w:p>
+        </w:tc>
+        <w:tc>
+          <w:tcPr/>
+          <w:p>
+            <w:pPr>
+              <w:pStyle w:val="Compact"/>
+            </w:pPr>
+            <w:r>
+              <w:t xml:space="preserve">inconclusive</w:t>
+            </w:r>
+          </w:p>
+        </w:tc>
+      </w:tr>
+      <w:tr>
+        <w:tc>
+          <w:tcPr/>
+          <w:p>
+            <w:pPr>
+              <w:pStyle w:val="Compact"/>
+            </w:pPr>
+            <w:r>
+              <w:t xml:space="preserve">4</w:t>
+            </w:r>
+          </w:p>
+        </w:tc>
+        <w:tc>
+          <w:tcPr/>
+          <w:p>
+            <w:pPr>
+              <w:pStyle w:val="Compact"/>
+            </w:pPr>
+            <w:r>
+              <w:t xml:space="preserve">1.195</w:t>
+            </w:r>
+          </w:p>
+        </w:tc>
+        <w:tc>
+          <w:tcPr/>
+          <w:p>
+            <w:pPr>
+              <w:pStyle w:val="Compact"/>
+            </w:pPr>
+            <w:r>
+              <w:t xml:space="preserve">0.957</w:t>
+            </w:r>
+          </w:p>
+        </w:tc>
+        <w:tc>
+          <w:tcPr/>
+          <w:p>
+            <w:pPr>
+              <w:pStyle w:val="Compact"/>
+            </w:pPr>
+            <w:r>
+              <w:t xml:space="preserve">1.492</w:t>
+            </w:r>
+          </w:p>
+        </w:tc>
+        <w:tc>
+          <w:tcPr/>
+          <w:p>
+            <w:pPr>
+              <w:pStyle w:val="Compact"/>
+            </w:pPr>
+            <w:r>
+              <w:t xml:space="preserve">2563</w:t>
+            </w:r>
+          </w:p>
+        </w:tc>
+        <w:tc>
+          <w:tcPr/>
+          <w:p>
+            <w:pPr>
+              <w:pStyle w:val="Compact"/>
+            </w:pPr>
+            <w:r>
+              <w:t xml:space="preserve">91</w:t>
+            </w:r>
+          </w:p>
+        </w:tc>
+        <w:tc>
+          <w:tcPr/>
+          <w:p>
+            <w:pPr>
+              <w:pStyle w:val="Compact"/>
+            </w:pPr>
+            <w:r>
+              <w:t xml:space="preserve">inconclusive</w:t>
+            </w:r>
+          </w:p>
+        </w:tc>
+      </w:tr>
+      <w:tr>
+        <w:tc>
+          <w:tcPr/>
+          <w:p>
+            <w:pPr>
+              <w:pStyle w:val="Compact"/>
+            </w:pPr>
+            <w:r>
+              <w:t xml:space="preserve">5</w:t>
+            </w:r>
+          </w:p>
+        </w:tc>
+        <w:tc>
+          <w:tcPr/>
+          <w:p>
+            <w:pPr>
+              <w:pStyle w:val="Compact"/>
+            </w:pPr>
+            <w:r>
+              <w:t xml:space="preserve">1.269</w:t>
+            </w:r>
+          </w:p>
+        </w:tc>
+        <w:tc>
+          <w:tcPr/>
+          <w:p>
+            <w:pPr>
+              <w:pStyle w:val="Compact"/>
+            </w:pPr>
+            <w:r>
+              <w:t xml:space="preserve">0.982</w:t>
+            </w:r>
+          </w:p>
+        </w:tc>
+        <w:tc>
+          <w:tcPr/>
+          <w:p>
+            <w:pPr>
+              <w:pStyle w:val="Compact"/>
+            </w:pPr>
+            <w:r>
+              <w:t xml:space="preserve">1.641</w:t>
+            </w:r>
+          </w:p>
+        </w:tc>
+        <w:tc>
+          <w:tcPr/>
+          <w:p>
+            <w:pPr>
+              <w:pStyle w:val="Compact"/>
+            </w:pPr>
+            <w:r>
+              <w:t xml:space="preserve">2563</w:t>
+            </w:r>
+          </w:p>
+        </w:tc>
+        <w:tc>
+          <w:tcPr/>
+          <w:p>
+            <w:pPr>
+              <w:pStyle w:val="Compact"/>
+            </w:pPr>
+            <w:r>
+              <w:t xml:space="preserve">91</w:t>
+            </w:r>
+          </w:p>
+        </w:tc>
+        <w:tc>
+          <w:tcPr/>
+          <w:p>
+            <w:pPr>
+              <w:pStyle w:val="Compact"/>
+            </w:pPr>
+            <w:r>
+              <w:t xml:space="preserve">inconclusive</w:t>
+            </w:r>
+          </w:p>
+        </w:tc>
+      </w:tr>
+    </w:tbl>
+    <w:p>
+      <w:pPr>
+        <w:pStyle w:val="FirstParagraph"/>
+      </w:pPr>
+      <w:r>
+        <w:t xml:space="preserve">ROR and A15 interval if k of the 28 upward-moved patients had developed AKI (outcomes swapped with k concordant cases; 400 bootstrap resamples, 200 permutations). Under the reference model, P(k = 0) = 0.26, P(k = 1) = 0.38, P(k ≥ 2) = 0.36.</w:t>
       </w:r>
     </w:p>
     <w:tbl>
@@ -18429,29 +19009,29 @@
               <w:pStyle w:val="Compact"/>
             </w:pPr>
             <w:r>
-              <w:t xml:space="preserve">0.940</w:t>
-            </w:r>
-          </w:p>
-        </w:tc>
-        <w:tc>
-          <w:tcPr/>
-          <w:p>
-            <w:pPr>
-              <w:pStyle w:val="Compact"/>
-            </w:pPr>
-            <w:r>
-              <w:t xml:space="preserve">0.596</w:t>
-            </w:r>
-          </w:p>
-        </w:tc>
-        <w:tc>
-          <w:tcPr/>
-          <w:p>
-            <w:pPr>
-              <w:pStyle w:val="Compact"/>
-            </w:pPr>
-            <w:r>
-              <w:t xml:space="preserve">1.483</w:t>
+              <w:t xml:space="preserve">1.097</w:t>
+            </w:r>
+          </w:p>
+        </w:tc>
+        <w:tc>
+          <w:tcPr/>
+          <w:p>
+            <w:pPr>
+              <w:pStyle w:val="Compact"/>
+            </w:pPr>
+            <w:r>
+              <w:t xml:space="preserve">0.704</w:t>
+            </w:r>
+          </w:p>
+        </w:tc>
+        <w:tc>
+          <w:tcPr/>
+          <w:p>
+            <w:pPr>
+              <w:pStyle w:val="Compact"/>
+            </w:pPr>
+            <w:r>
+              <w:t xml:space="preserve">1.709</w:t>
             </w:r>
           </w:p>
         </w:tc>
@@ -20896,7 +21476,7 @@
         <w:t xml:space="preserve"> </w:t>
       </w:r>
       <w:r>
-        <w:t xml:space="preserve">T ∈ {55, 60, 65} mmHg.</w:t>
+        <w:t xml:space="preserve">T in {55, 60, 65} mmHg.</w:t>
       </w:r>
     </w:p>
     <w:p>
@@ -22269,7 +22849,7 @@
         <w:t xml:space="preserve"> </w:t>
       </w:r>
       <w:r>
-        <w:t xml:space="preserve">margin 0.80–1.25: CI entirely within →</w:t>
+        <w:t xml:space="preserve">margin 0.80–1.25: CI entirely within -&gt;</w:t>
       </w:r>
       <w:r>
         <w:t xml:space="preserve"> </w:t>
@@ -22284,7 +22864,7 @@
         <w:t xml:space="preserve">association”</w:t>
       </w:r>
       <w:r>
-        <w:t xml:space="preserve">; CI excludes 1 and point estimate outside the margin →</w:t>
+        <w:t xml:space="preserve">; CI excludes 1 and point estimate outside the margin -&gt;</w:t>
       </w:r>
       <w:r>
         <w:t xml:space="preserve"> </w:t>
@@ -23795,6 +24375,129 @@
       </w:r>
       <w:r>
         <w:t xml:space="preserve">performance by nadir, injection sweep.</w:t>
+      </w:r>
+    </w:p>
+    <w:p>
+      <w:pPr>
+        <w:pStyle w:val="BodyText"/>
+      </w:pPr>
+      <w:r>
+        <w:rPr>
+          <w:b/>
+          <w:bCs/>
+        </w:rPr>
+        <w:t xml:space="preserve">Round-2 review changes (2026-10-26).</w:t>
+      </w:r>
+      <w:r>
+        <w:t xml:space="preserve"> </w:t>
+      </w:r>
+      <w:r>
+        <w:t xml:space="preserve">A coding error in the post hoc</w:t>
+      </w:r>
+      <w:r>
+        <w:t xml:space="preserve"> </w:t>
+      </w:r>
+      <w:r>
+        <w:t xml:space="preserve">“without duration”</w:t>
+      </w:r>
+      <w:r>
+        <w:t xml:space="preserve"> </w:t>
+      </w:r>
+      <w:r>
+        <w:t xml:space="preserve">model</w:t>
+      </w:r>
+      <w:r>
+        <w:t xml:space="preserve"> </w:t>
+      </w:r>
+      <w:r>
+        <w:t xml:space="preserve">(</w:t>
+      </w:r>
+      <w:r>
+        <w:rPr>
+          <w:rStyle w:val="VerbatimChar"/>
+        </w:rPr>
+        <w:t xml:space="preserve">posthoc_models.py</w:t>
+      </w:r>
+      <w:r>
+        <w:t xml:space="preserve"> </w:t>
+      </w:r>
+      <w:r>
+        <w:t xml:space="preserve">fixed</w:t>
+      </w:r>
+      <w:r>
+        <w:t xml:space="preserve"> </w:t>
+      </w:r>
+      <w:r>
+        <w:rPr>
+          <w:rStyle w:val="VerbatimChar"/>
+        </w:rPr>
+        <w:t xml:space="preserve">ane_dur_h</w:t>
+      </w:r>
+      <w:r>
+        <w:t xml:space="preserve"> </w:t>
+      </w:r>
+      <w:r>
+        <w:t xml:space="preserve">instead of the</w:t>
+      </w:r>
+      <w:r>
+        <w:t xml:space="preserve"> </w:t>
+      </w:r>
+      <w:r>
+        <w:rPr>
+          <w:rStyle w:val="VerbatimChar"/>
+        </w:rPr>
+        <w:t xml:space="preserve">log_dur</w:t>
+      </w:r>
+      <w:r>
+        <w:t xml:space="preserve"> </w:t>
+      </w:r>
+      <w:r>
+        <w:t xml:space="preserve">column the model uses) was</w:t>
+      </w:r>
+      <w:r>
+        <w:t xml:space="preserve"> </w:t>
+      </w:r>
+      <w:r>
+        <w:t xml:space="preserve">corrected; the corrected estimate is 1.10 (0.70–1.71). The A11 rule is reported as the</w:t>
+      </w:r>
+      <w:r>
+        <w:t xml:space="preserve"> </w:t>
+      </w:r>
+      <w:r>
+        <w:t xml:space="preserve">single split selected by the tree search.</w:t>
+      </w:r>
+      <w:r>
+        <w:t xml:space="preserve"> </w:t>
+      </w:r>
+      <w:r>
+        <w:t xml:space="preserve">“Artefact”</w:t>
+      </w:r>
+      <w:r>
+        <w:t xml:space="preserve"> </w:t>
+      </w:r>
+      <w:r>
+        <w:t xml:space="preserve">in the text denotes waveform-flagged</w:t>
+      </w:r>
+      <w:r>
+        <w:t xml:space="preserve"> </w:t>
+      </w:r>
+      <w:r>
+        <w:t xml:space="preserve">values (A1). The fragility of the primary verdict to AKI among the discordant patients was</w:t>
+      </w:r>
+      <w:r>
+        <w:t xml:space="preserve"> </w:t>
+      </w:r>
+      <w:r>
+        <w:t xml:space="preserve">quantified post hoc (</w:t>
+      </w:r>
+      <w:r>
+        <w:rPr>
+          <w:rStyle w:val="VerbatimChar"/>
+        </w:rPr>
+        <w:t xml:space="preserve">src/posthoc_k.py</w:t>
+      </w:r>
+      <w:r>
+        <w:t xml:space="preserve">).</w:t>
       </w:r>
     </w:p>
     <w:sectPr>

</xml_diff>